<commit_message>
Normalize homework report markdown covers
</commit_message>
<xml_diff>
--- a/01/docs/answer/answer.docx
+++ b/01/docs/answer/answer.docx
@@ -113,8 +113,7 @@
     <w:tbl>
       <w:tblPr>
         <w:tblStyle w:val="Table"/>
-        <w:tblW w:type="pct" w:w="5000"/>
-        <w:tblLayout w:type="fixed"/>
+        <w:tblW w:type="auto" w:w="0"/>
         <w:tblLook w:firstRow="1" w:lastRow="0" w:firstColumn="0" w:lastColumn="0" w:noHBand="0" w:noVBand="0" w:val="0020"/>
       </w:tblPr>
       <w:tblGrid>
@@ -168,7 +167,7 @@
               <w:rPr>
                 <w:rFonts w:hint="eastAsia"/>
               </w:rPr>
-              <w:t xml:space="preserve">作业编号</w:t>
+              <w:t xml:space="preserve">源题编号</w:t>
             </w:r>
           </w:p>
         </w:tc>
@@ -200,7 +199,7 @@
               <w:rPr>
                 <w:rFonts w:hint="eastAsia"/>
               </w:rPr>
-              <w:t xml:space="preserve">作业目录</w:t>
+              <w:t xml:space="preserve">学生姓名</w:t>
             </w:r>
           </w:p>
         </w:tc>
@@ -213,9 +212,9 @@
             </w:pPr>
             <w:r>
               <w:rPr>
-                <w:rStyle w:val="VerbatimChar"/>
+                <w:rFonts w:hint="eastAsia"/>
               </w:rPr>
-              <w:t xml:space="preserve">HW/01</w:t>
+              <w:t xml:space="preserve">姜玥晟</w:t>
             </w:r>
           </w:p>
         </w:tc>
@@ -232,7 +231,7 @@
               <w:rPr>
                 <w:rFonts w:hint="eastAsia"/>
               </w:rPr>
-              <w:t xml:space="preserve">学生姓名</w:t>
+              <w:t xml:space="preserve">报告主题</w:t>
             </w:r>
           </w:p>
         </w:tc>
@@ -244,10 +243,13 @@
               <w:jc w:val="left"/>
             </w:pPr>
             <w:r>
+              <w:t xml:space="preserve">LCRS </w:t>
+            </w:r>
+            <w:r>
               <w:rPr>
                 <w:rFonts w:hint="eastAsia"/>
               </w:rPr>
-              <w:t xml:space="preserve">姜玥晟</w:t>
+              <w:t xml:space="preserve">星系样本清洗、极值统计与三维可视化</w:t>
             </w:r>
           </w:p>
         </w:tc>
@@ -264,7 +266,7 @@
               <w:rPr>
                 <w:rFonts w:hint="eastAsia"/>
               </w:rPr>
-              <w:t xml:space="preserve">报告主题</w:t>
+              <w:t xml:space="preserve">实验环境</w:t>
             </w:r>
           </w:p>
         </w:tc>
@@ -276,41 +278,6 @@
               <w:jc w:val="left"/>
             </w:pPr>
             <w:r>
-              <w:t xml:space="preserve">LCRS </w:t>
-            </w:r>
-            <w:r>
-              <w:rPr>
-                <w:rFonts w:hint="eastAsia"/>
-              </w:rPr>
-              <w:t xml:space="preserve">星系样本清洗、极值统计与三维可视化</w:t>
-            </w:r>
-          </w:p>
-        </w:tc>
-      </w:tr>
-      <w:tr>
-        <w:tc>
-          <w:tcPr/>
-          <w:p>
-            <w:pPr>
-              <w:pStyle w:val="Compact"/>
-              <w:jc w:val="left"/>
-            </w:pPr>
-            <w:r>
-              <w:rPr>
-                <w:rFonts w:hint="eastAsia"/>
-              </w:rPr>
-              <w:t xml:space="preserve">实验环境</w:t>
-            </w:r>
-          </w:p>
-        </w:tc>
-        <w:tc>
-          <w:tcPr/>
-          <w:p>
-            <w:pPr>
-              <w:pStyle w:val="Compact"/>
-              <w:jc w:val="left"/>
-            </w:pPr>
-            <w:r>
               <w:rPr>
                 <w:rStyle w:val="VerbatimChar"/>
               </w:rPr>
@@ -342,77 +309,6 @@
                 <w:rFonts w:hint="eastAsia"/>
               </w:rPr>
               <w:t xml:space="preserve">三维绘图</w:t>
-            </w:r>
-          </w:p>
-        </w:tc>
-      </w:tr>
-      <w:tr>
-        <w:tc>
-          <w:tcPr/>
-          <w:p>
-            <w:pPr>
-              <w:pStyle w:val="Compact"/>
-              <w:jc w:val="left"/>
-            </w:pPr>
-            <w:r>
-              <w:rPr>
-                <w:rFonts w:hint="eastAsia"/>
-              </w:rPr>
-              <w:t xml:space="preserve">报告说明</w:t>
-            </w:r>
-          </w:p>
-        </w:tc>
-        <w:tc>
-          <w:tcPr/>
-          <w:p>
-            <w:pPr>
-              <w:pStyle w:val="Compact"/>
-              <w:jc w:val="left"/>
-            </w:pPr>
-            <w:r>
-              <w:rPr>
-                <w:rFonts w:hint="eastAsia"/>
-              </w:rPr>
-              <w:t xml:space="preserve">正文按题目编号组织，完整程序与原始结果保留于</w:t>
-            </w:r>
-            <w:r>
-              <w:t xml:space="preserve"> </w:t>
-            </w:r>
-            <w:r>
-              <w:rPr>
-                <w:rStyle w:val="VerbatimChar"/>
-              </w:rPr>
-              <w:t xml:space="preserve">scripts/</w:t>
-            </w:r>
-            <w:r>
-              <w:t xml:space="preserve">、</w:t>
-            </w:r>
-            <w:r>
-              <w:rPr>
-                <w:rStyle w:val="VerbatimChar"/>
-              </w:rPr>
-              <w:t xml:space="preserve">result/</w:t>
-            </w:r>
-            <w:r>
-              <w:t xml:space="preserve"> </w:t>
-            </w:r>
-            <w:r>
-              <w:rPr>
-                <w:rFonts w:hint="eastAsia"/>
-              </w:rPr>
-              <w:t xml:space="preserve">和</w:t>
-            </w:r>
-            <w:r>
-              <w:t xml:space="preserve"> </w:t>
-            </w:r>
-            <w:r>
-              <w:rPr>
-                <w:rStyle w:val="VerbatimChar"/>
-              </w:rPr>
-              <w:t xml:space="preserve">results/</w:t>
-            </w:r>
-            <w:r>
-              <w:t xml:space="preserve">。</w:t>
             </w:r>
           </w:p>
         </w:tc>

</xml_diff>

<commit_message>
Normalize legacy homework answer structure
</commit_message>
<xml_diff>
--- a/01/docs/answer/answer.docx
+++ b/01/docs/answer/answer.docx
@@ -314,12 +314,28 @@
         </w:tc>
       </w:tr>
     </w:tbl>
-    <w:bookmarkStart w:id="22" w:name="lcrs-星系样本的清洗与极值统计"/>
+    <w:bookmarkStart w:id="12" w:name="i.-lcrs-星系样本的清洗与极值统计"/>
     <w:p>
       <w:pPr>
         <w:pStyle w:val="Heading1"/>
       </w:pPr>
       <w:r>
+        <w:t xml:space="preserve">I. LCRS </w:t>
+      </w:r>
+      <w:r>
+        <w:rPr>
+          <w:rFonts w:hint="eastAsia"/>
+        </w:rPr>
+        <w:t xml:space="preserve">星系样本的清洗与极值统计</w:t>
+      </w:r>
+    </w:p>
+    <w:bookmarkEnd w:id="12"/>
+    <w:bookmarkStart w:id="25" w:name="problem-1lcrs-星系样本的清洗与极值统计"/>
+    <w:p>
+      <w:pPr>
+        <w:pStyle w:val="Heading1"/>
+      </w:pPr>
+      <w:r>
         <w:rPr>
           <w:rStyle w:val="SectionNumber"/>
         </w:rPr>
@@ -329,7 +345,16 @@
         <w:tab/>
       </w:r>
       <w:r>
-        <w:t xml:space="preserve">LCRS </w:t>
+        <w:t xml:space="preserve">Problem </w:t>
+      </w:r>
+      <w:r>
+        <w:rPr>
+          <w:rFonts w:hint="eastAsia"/>
+        </w:rPr>
+        <w:t xml:space="preserve">1：LCRS</w:t>
+      </w:r>
+      <w:r>
+        <w:t xml:space="preserve"> </w:t>
       </w:r>
       <w:r>
         <w:rPr>
@@ -338,7 +363,59 @@
         <w:t xml:space="preserve">星系样本的清洗与极值统计</w:t>
       </w:r>
     </w:p>
-    <w:bookmarkStart w:id="15" w:name="题目陈述"/>
+    <w:p>
+      <w:pPr>
+        <w:pStyle w:val="FirstParagraph"/>
+      </w:pPr>
+      <w:r>
+        <w:rPr>
+          <w:rFonts w:hint="eastAsia"/>
+        </w:rPr>
+        <w:t xml:space="preserve">相关脚本：</w:t>
+      </w:r>
+    </w:p>
+    <w:p>
+      <w:pPr>
+        <w:pStyle w:val="Compact"/>
+        <w:numPr>
+          <w:ilvl w:val="0"/>
+          <w:numId w:val="1001"/>
+        </w:numPr>
+      </w:pPr>
+      <w:hyperlink r:id="rId13">
+        <w:r>
+          <w:rPr>
+            <w:rStyle w:val="Hyperlink"/>
+            <w:rFonts w:hint="eastAsia"/>
+          </w:rPr>
+          <w:t xml:space="preserve">本地</w:t>
+        </w:r>
+        <w:r>
+          <w:rPr>
+            <w:rStyle w:val="Hyperlink"/>
+          </w:rPr>
+          <w:t xml:space="preserve"> scripts/problem1.py</w:t>
+        </w:r>
+      </w:hyperlink>
+    </w:p>
+    <w:p>
+      <w:pPr>
+        <w:pStyle w:val="Compact"/>
+        <w:numPr>
+          <w:ilvl w:val="0"/>
+          <w:numId w:val="1001"/>
+        </w:numPr>
+      </w:pPr>
+      <w:hyperlink r:id="rId14">
+        <w:r>
+          <w:rPr>
+            <w:rStyle w:val="Hyperlink"/>
+          </w:rPr>
+          <w:t xml:space="preserve">GitHub scripts/problem1.py</w:t>
+        </w:r>
+      </w:hyperlink>
+    </w:p>
+    <w:bookmarkStart w:id="18" w:name="待求问题"/>
     <w:p>
       <w:pPr>
         <w:pStyle w:val="Heading2"/>
@@ -356,7 +433,7 @@
         <w:rPr>
           <w:rFonts w:hint="eastAsia"/>
         </w:rPr>
-        <w:t xml:space="preserve">题目陈述</w:t>
+        <w:t xml:space="preserve">待求问题</w:t>
       </w:r>
     </w:p>
     <w:p>
@@ -430,7 +507,7 @@
         <w:t xml:space="preserve"> absolute magnitude。</w:t>
       </w:r>
     </w:p>
-    <w:bookmarkStart w:id="12" w:name="a-数据清洗与速度极值"/>
+    <w:bookmarkStart w:id="15" w:name="a-数据清洗与速度极值"/>
     <w:p>
       <w:pPr>
         <w:pStyle w:val="Heading3"/>
@@ -474,8 +551,8 @@
         <w:t xml:space="preserve">的最小值与最大值。</w:t>
       </w:r>
     </w:p>
-    <w:bookmarkEnd w:id="12"/>
-    <w:bookmarkStart w:id="13" w:name="b-最亮与最暗星系"/>
+    <w:bookmarkEnd w:id="15"/>
+    <w:bookmarkStart w:id="16" w:name="b-最亮与最暗星系"/>
     <w:p>
       <w:pPr>
         <w:pStyle w:val="Heading3"/>
@@ -513,8 +590,8 @@
         <w:t xml:space="preserve"> recession velocity。</w:t>
       </w:r>
     </w:p>
-    <w:bookmarkEnd w:id="13"/>
-    <w:bookmarkStart w:id="14" w:name="c-选择效应解释"/>
+    <w:bookmarkEnd w:id="16"/>
+    <w:bookmarkStart w:id="17" w:name="c-选择效应解释"/>
     <w:p>
       <w:pPr>
         <w:pStyle w:val="Heading3"/>
@@ -581,9 +658,9 @@
         <w:t xml:space="preserve">。</w:t>
       </w:r>
     </w:p>
-    <w:bookmarkEnd w:id="14"/>
-    <w:bookmarkEnd w:id="15"/>
-    <w:bookmarkStart w:id="16" w:name="解决方案"/>
+    <w:bookmarkEnd w:id="17"/>
+    <w:bookmarkEnd w:id="18"/>
+    <w:bookmarkStart w:id="19" w:name="解决方式"/>
     <w:p>
       <w:pPr>
         <w:pStyle w:val="Heading2"/>
@@ -601,7 +678,7 @@
         <w:rPr>
           <w:rFonts w:hint="eastAsia"/>
         </w:rPr>
-        <w:t xml:space="preserve">解决方案</w:t>
+        <w:t xml:space="preserve">解决方式</w:t>
       </w:r>
     </w:p>
     <w:p>
@@ -859,8 +936,8 @@
         <w:t xml:space="preserve">输出最终统计结果。</w:t>
       </w:r>
     </w:p>
-    <w:bookmarkEnd w:id="16"/>
-    <w:bookmarkStart w:id="20" w:name="问题答案"/>
+    <w:bookmarkEnd w:id="19"/>
+    <w:bookmarkStart w:id="23" w:name="问题答案"/>
     <w:p>
       <w:pPr>
         <w:pStyle w:val="Heading2"/>
@@ -1258,7 +1335,7 @@
         </w:tc>
       </w:tr>
     </w:tbl>
-    <w:bookmarkStart w:id="17" w:name="a-数据清洗与速度极值-1"/>
+    <w:bookmarkStart w:id="20" w:name="a-数据清洗与速度极值-1"/>
     <w:p>
       <w:pPr>
         <w:pStyle w:val="Heading3"/>
@@ -1362,8 +1439,8 @@
         <w:t xml:space="preserve">。</w:t>
       </w:r>
     </w:p>
-    <w:bookmarkEnd w:id="17"/>
-    <w:bookmarkStart w:id="18" w:name="b-最亮与最暗星系-1"/>
+    <w:bookmarkEnd w:id="20"/>
+    <w:bookmarkStart w:id="21" w:name="b-最亮与最暗星系-1"/>
     <w:p>
       <w:pPr>
         <w:pStyle w:val="Heading3"/>
@@ -1491,8 +1568,8 @@
         <w:t xml:space="preserve">。</w:t>
       </w:r>
     </w:p>
-    <w:bookmarkEnd w:id="18"/>
-    <w:bookmarkStart w:id="19" w:name="c-选择效应解释-1"/>
+    <w:bookmarkEnd w:id="21"/>
+    <w:bookmarkStart w:id="22" w:name="c-选择效应解释-1"/>
     <w:p>
       <w:pPr>
         <w:pStyle w:val="Heading3"/>
@@ -1545,9 +1622,9 @@
         <w:t xml:space="preserve">的选择效应一致。距离较远的星系若要进入样本，必须具有更高的本征亮度；本征较暗的星系则往往只会在较近距离被观测到。</w:t>
       </w:r>
     </w:p>
-    <w:bookmarkEnd w:id="19"/>
-    <w:bookmarkEnd w:id="20"/>
-    <w:bookmarkStart w:id="21" w:name="讨论和扩展"/>
+    <w:bookmarkEnd w:id="22"/>
+    <w:bookmarkEnd w:id="23"/>
+    <w:bookmarkStart w:id="24" w:name="分析"/>
     <w:p>
       <w:pPr>
         <w:pStyle w:val="Heading2"/>
@@ -1565,7 +1642,7 @@
         <w:rPr>
           <w:rFonts w:hint="eastAsia"/>
         </w:rPr>
-        <w:t xml:space="preserve">讨论和扩展</w:t>
+        <w:t xml:space="preserve">分析</w:t>
       </w:r>
     </w:p>
     <w:p>
@@ -1630,158 +1707,112 @@
           <w:rFonts w:hint="eastAsia"/>
         </w:rPr>
         <w:t xml:space="preserve">，说明样本已经跨越较宽的距离尺度。因此，极值对比并非局部波动，而是样本筛选机制在全体观测中的直接反映。</w:t>
-      </w:r>
-    </w:p>
-    <w:bookmarkEnd w:id="21"/>
-    <w:bookmarkEnd w:id="22"/>
-    <w:bookmarkStart w:id="34" w:name="lcrs-数据的三维可视化"/>
-    <w:p>
-      <w:pPr>
-        <w:pStyle w:val="Heading1"/>
-      </w:pPr>
-      <w:r>
-        <w:rPr>
-          <w:rStyle w:val="SectionNumber"/>
-        </w:rPr>
-        <w:t xml:space="preserve">2</w:t>
-      </w:r>
-      <w:r>
-        <w:tab/>
-      </w:r>
-      <w:r>
-        <w:t xml:space="preserve">LCRS </w:t>
-      </w:r>
-      <w:r>
-        <w:rPr>
-          <w:rFonts w:hint="eastAsia"/>
-        </w:rPr>
-        <w:t xml:space="preserve">数据的三维可视化</w:t>
-      </w:r>
-    </w:p>
-    <w:bookmarkStart w:id="25" w:name="题目陈述-1"/>
-    <w:p>
-      <w:pPr>
-        <w:pStyle w:val="Heading2"/>
-      </w:pPr>
-      <w:r>
-        <w:rPr>
-          <w:rStyle w:val="SectionNumber"/>
-        </w:rPr>
-        <w:t xml:space="preserve">2.1</w:t>
-      </w:r>
-      <w:r>
-        <w:tab/>
-      </w:r>
-      <w:r>
-        <w:rPr>
-          <w:rFonts w:hint="eastAsia"/>
-        </w:rPr>
-        <w:t xml:space="preserve">题目陈述</w:t>
-      </w:r>
-    </w:p>
-    <w:p>
-      <w:pPr>
-        <w:pStyle w:val="FirstParagraph"/>
-      </w:pPr>
-      <w:r>
-        <w:rPr>
-          <w:rFonts w:hint="eastAsia"/>
-        </w:rPr>
-        <w:t xml:space="preserve">题目要求把</w:t>
-      </w:r>
-      <w:r>
-        <w:t xml:space="preserve"> LCRS </w:t>
-      </w:r>
-      <w:r>
-        <w:rPr>
-          <w:rFonts w:hint="eastAsia"/>
-        </w:rPr>
-        <w:t xml:space="preserve">数据视为以太阳为原点的三维球坐标样本，并从不同视角观察其空间分布。</w:t>
-      </w:r>
-    </w:p>
-    <w:bookmarkStart w:id="23" w:name="三维坐标构造"/>
-    <w:p>
-      <w:pPr>
-        <w:pStyle w:val="Heading3"/>
-      </w:pPr>
-      <w:r>
-        <w:rPr>
-          <w:rStyle w:val="SectionNumber"/>
-        </w:rPr>
-        <w:t xml:space="preserve">2.1.1</w:t>
-      </w:r>
-      <w:r>
-        <w:tab/>
-      </w:r>
-      <w:r>
-        <w:t xml:space="preserve">(1) </w:t>
-      </w:r>
-      <w:r>
-        <w:rPr>
-          <w:rFonts w:hint="eastAsia"/>
-        </w:rPr>
-        <w:t xml:space="preserve">三维坐标构造</w:t>
-      </w:r>
-    </w:p>
-    <w:p>
-      <w:pPr>
-        <w:pStyle w:val="FirstParagraph"/>
-      </w:pPr>
-      <w:r>
-        <w:rPr>
-          <w:rFonts w:hint="eastAsia"/>
-        </w:rPr>
-        <w:t xml:space="preserve">已知第一列</w:t>
-      </w:r>
-      <w:r>
-        <w:t xml:space="preserve"> recession velocity </w:t>
-      </w:r>
-      <w:r>
-        <w:rPr>
-          <w:rFonts w:hint="eastAsia"/>
-        </w:rPr>
-        <w:t xml:space="preserve">作为径向距离，第二、三列分别提供方向信息，因此需要将球坐标样本转换为笛卡尔坐标。</w:t>
-      </w:r>
-    </w:p>
-    <w:bookmarkEnd w:id="23"/>
-    <w:bookmarkStart w:id="24" w:name="多视角可视化"/>
-    <w:p>
-      <w:pPr>
-        <w:pStyle w:val="Heading3"/>
-      </w:pPr>
-      <w:r>
-        <w:rPr>
-          <w:rStyle w:val="SectionNumber"/>
-        </w:rPr>
-        <w:t xml:space="preserve">2.1.2</w:t>
-      </w:r>
-      <w:r>
-        <w:tab/>
-      </w:r>
-      <w:r>
-        <w:t xml:space="preserve">(2) </w:t>
-      </w:r>
-      <w:r>
-        <w:rPr>
-          <w:rFonts w:hint="eastAsia"/>
-        </w:rPr>
-        <w:t xml:space="preserve">多视角可视化</w:t>
-      </w:r>
-    </w:p>
-    <w:p>
-      <w:pPr>
-        <w:pStyle w:val="FirstParagraph"/>
-      </w:pPr>
-      <w:r>
-        <w:rPr>
-          <w:rFonts w:hint="eastAsia"/>
-        </w:rPr>
-        <w:t xml:space="preserve">在完成三维建模后，还需要从不同视角观察其空间分布。</w:t>
       </w:r>
     </w:p>
     <w:bookmarkEnd w:id="24"/>
     <w:bookmarkEnd w:id="25"/>
-    <w:bookmarkStart w:id="26" w:name="解决方案-1"/>
+    <w:bookmarkStart w:id="26" w:name="ii.-lcrs-数据的三维可视化"/>
+    <w:p>
+      <w:pPr>
+        <w:pStyle w:val="Heading1"/>
+      </w:pPr>
+      <w:r>
+        <w:t xml:space="preserve">II. LCRS </w:t>
+      </w:r>
+      <w:r>
+        <w:rPr>
+          <w:rFonts w:hint="eastAsia"/>
+        </w:rPr>
+        <w:t xml:space="preserve">数据的三维可视化</w:t>
+      </w:r>
+    </w:p>
+    <w:bookmarkEnd w:id="26"/>
+    <w:bookmarkStart w:id="40" w:name="problem-2lcrs-数据的三维可视化"/>
+    <w:p>
+      <w:pPr>
+        <w:pStyle w:val="Heading1"/>
+      </w:pPr>
+      <w:r>
+        <w:rPr>
+          <w:rStyle w:val="SectionNumber"/>
+        </w:rPr>
+        <w:t xml:space="preserve">2</w:t>
+      </w:r>
+      <w:r>
+        <w:tab/>
+      </w:r>
+      <w:r>
+        <w:t xml:space="preserve">Problem </w:t>
+      </w:r>
+      <w:r>
+        <w:rPr>
+          <w:rFonts w:hint="eastAsia"/>
+        </w:rPr>
+        <w:t xml:space="preserve">2：LCRS</w:t>
+      </w:r>
+      <w:r>
+        <w:t xml:space="preserve"> </w:t>
+      </w:r>
+      <w:r>
+        <w:rPr>
+          <w:rFonts w:hint="eastAsia"/>
+        </w:rPr>
+        <w:t xml:space="preserve">数据的三维可视化</w:t>
+      </w:r>
+    </w:p>
+    <w:p>
+      <w:pPr>
+        <w:pStyle w:val="FirstParagraph"/>
+      </w:pPr>
+      <w:r>
+        <w:rPr>
+          <w:rFonts w:hint="eastAsia"/>
+        </w:rPr>
+        <w:t xml:space="preserve">相关脚本：</w:t>
+      </w:r>
+    </w:p>
+    <w:p>
+      <w:pPr>
+        <w:pStyle w:val="Compact"/>
+        <w:numPr>
+          <w:ilvl w:val="0"/>
+          <w:numId w:val="1002"/>
+        </w:numPr>
+      </w:pPr>
+      <w:hyperlink r:id="rId27">
+        <w:r>
+          <w:rPr>
+            <w:rStyle w:val="Hyperlink"/>
+            <w:rFonts w:hint="eastAsia"/>
+          </w:rPr>
+          <w:t xml:space="preserve">本地</w:t>
+        </w:r>
+        <w:r>
+          <w:rPr>
+            <w:rStyle w:val="Hyperlink"/>
+          </w:rPr>
+          <w:t xml:space="preserve"> scripts/problem2.py</w:t>
+        </w:r>
+      </w:hyperlink>
+    </w:p>
+    <w:p>
+      <w:pPr>
+        <w:pStyle w:val="Compact"/>
+        <w:numPr>
+          <w:ilvl w:val="0"/>
+          <w:numId w:val="1002"/>
+        </w:numPr>
+      </w:pPr>
+      <w:hyperlink r:id="rId28">
+        <w:r>
+          <w:rPr>
+            <w:rStyle w:val="Hyperlink"/>
+          </w:rPr>
+          <w:t xml:space="preserve">GitHub scripts/problem2.py</w:t>
+        </w:r>
+      </w:hyperlink>
+    </w:p>
+    <w:bookmarkStart w:id="31" w:name="待求问题-1"/>
     <w:p>
       <w:pPr>
         <w:pStyle w:val="Heading2"/>
@@ -1790,6 +1821,129 @@
         <w:rPr>
           <w:rStyle w:val="SectionNumber"/>
         </w:rPr>
+        <w:t xml:space="preserve">2.1</w:t>
+      </w:r>
+      <w:r>
+        <w:tab/>
+      </w:r>
+      <w:r>
+        <w:rPr>
+          <w:rFonts w:hint="eastAsia"/>
+        </w:rPr>
+        <w:t xml:space="preserve">待求问题</w:t>
+      </w:r>
+    </w:p>
+    <w:p>
+      <w:pPr>
+        <w:pStyle w:val="FirstParagraph"/>
+      </w:pPr>
+      <w:r>
+        <w:rPr>
+          <w:rFonts w:hint="eastAsia"/>
+        </w:rPr>
+        <w:t xml:space="preserve">题目要求把</w:t>
+      </w:r>
+      <w:r>
+        <w:t xml:space="preserve"> LCRS </w:t>
+      </w:r>
+      <w:r>
+        <w:rPr>
+          <w:rFonts w:hint="eastAsia"/>
+        </w:rPr>
+        <w:t xml:space="preserve">数据视为以太阳为原点的三维球坐标样本，并从不同视角观察其空间分布。</w:t>
+      </w:r>
+    </w:p>
+    <w:bookmarkStart w:id="29" w:name="三维坐标构造"/>
+    <w:p>
+      <w:pPr>
+        <w:pStyle w:val="Heading3"/>
+      </w:pPr>
+      <w:r>
+        <w:rPr>
+          <w:rStyle w:val="SectionNumber"/>
+        </w:rPr>
+        <w:t xml:space="preserve">2.1.1</w:t>
+      </w:r>
+      <w:r>
+        <w:tab/>
+      </w:r>
+      <w:r>
+        <w:t xml:space="preserve">(1) </w:t>
+      </w:r>
+      <w:r>
+        <w:rPr>
+          <w:rFonts w:hint="eastAsia"/>
+        </w:rPr>
+        <w:t xml:space="preserve">三维坐标构造</w:t>
+      </w:r>
+    </w:p>
+    <w:p>
+      <w:pPr>
+        <w:pStyle w:val="FirstParagraph"/>
+      </w:pPr>
+      <w:r>
+        <w:rPr>
+          <w:rFonts w:hint="eastAsia"/>
+        </w:rPr>
+        <w:t xml:space="preserve">已知第一列</w:t>
+      </w:r>
+      <w:r>
+        <w:t xml:space="preserve"> recession velocity </w:t>
+      </w:r>
+      <w:r>
+        <w:rPr>
+          <w:rFonts w:hint="eastAsia"/>
+        </w:rPr>
+        <w:t xml:space="preserve">作为径向距离，第二、三列分别提供方向信息，因此需要将球坐标样本转换为笛卡尔坐标。</w:t>
+      </w:r>
+    </w:p>
+    <w:bookmarkEnd w:id="29"/>
+    <w:bookmarkStart w:id="30" w:name="多视角可视化"/>
+    <w:p>
+      <w:pPr>
+        <w:pStyle w:val="Heading3"/>
+      </w:pPr>
+      <w:r>
+        <w:rPr>
+          <w:rStyle w:val="SectionNumber"/>
+        </w:rPr>
+        <w:t xml:space="preserve">2.1.2</w:t>
+      </w:r>
+      <w:r>
+        <w:tab/>
+      </w:r>
+      <w:r>
+        <w:t xml:space="preserve">(2) </w:t>
+      </w:r>
+      <w:r>
+        <w:rPr>
+          <w:rFonts w:hint="eastAsia"/>
+        </w:rPr>
+        <w:t xml:space="preserve">多视角可视化</w:t>
+      </w:r>
+    </w:p>
+    <w:p>
+      <w:pPr>
+        <w:pStyle w:val="FirstParagraph"/>
+      </w:pPr>
+      <w:r>
+        <w:rPr>
+          <w:rFonts w:hint="eastAsia"/>
+        </w:rPr>
+        <w:t xml:space="preserve">在完成三维建模后，还需要从不同视角观察其空间分布。</w:t>
+      </w:r>
+    </w:p>
+    <w:bookmarkEnd w:id="30"/>
+    <w:bookmarkEnd w:id="31"/>
+    <w:bookmarkStart w:id="32" w:name="解决方式-1"/>
+    <w:p>
+      <w:pPr>
+        <w:pStyle w:val="Heading2"/>
+      </w:pPr>
+      <w:r>
+        <w:rPr>
+          <w:rStyle w:val="SectionNumber"/>
+        </w:rPr>
         <w:t xml:space="preserve">2.2</w:t>
       </w:r>
       <w:r>
@@ -1799,7 +1953,7 @@
         <w:rPr>
           <w:rFonts w:hint="eastAsia"/>
         </w:rPr>
-        <w:t xml:space="preserve">解决方案</w:t>
+        <w:t xml:space="preserve">解决方式</w:t>
       </w:r>
     </w:p>
     <w:p>
@@ -1958,8 +2112,8 @@
         <w:t xml:space="preserve">其中颜色与点大小共同编码星系亮度，以便在空间位置之外同时保留亮度信息。</w:t>
       </w:r>
     </w:p>
-    <w:bookmarkEnd w:id="26"/>
-    <w:bookmarkStart w:id="32" w:name="问题答案-1"/>
+    <w:bookmarkEnd w:id="32"/>
+    <w:bookmarkStart w:id="38" w:name="问题答案-1"/>
     <w:p>
       <w:pPr>
         <w:pStyle w:val="Heading2"/>
@@ -1980,7 +2134,7 @@
         <w:t xml:space="preserve">问题答案</w:t>
       </w:r>
     </w:p>
-    <w:bookmarkStart w:id="30" w:name="三维坐标构造-1"/>
+    <w:bookmarkStart w:id="36" w:name="三维坐标构造-1"/>
     <w:p>
       <w:pPr>
         <w:pStyle w:val="Heading3"/>
@@ -2033,18 +2187,18 @@
           <wp:inline>
             <wp:extent cx="5067300" cy="3898468"/>
             <wp:effectExtent b="0" l="0" r="0" t="0"/>
-            <wp:docPr descr="LCRS 数据的三维总览与三组投影视图" title="" id="28" name="Picture"/>
+            <wp:docPr descr="LCRS 数据的三维总览与三组投影视图" title="" id="34" name="Picture"/>
             <a:graphic>
               <a:graphicData uri="http://schemas.openxmlformats.org/drawingml/2006/picture">
                 <pic:pic>
                   <pic:nvPicPr>
-                    <pic:cNvPr descr="../../result/lcrs_3d_views.png" id="29" name="Picture"/>
+                    <pic:cNvPr descr="../../result/lcrs_3d_views.png" id="35" name="Picture"/>
                     <pic:cNvPicPr>
                       <a:picLocks noChangeArrowheads="1" noChangeAspect="1"/>
                     </pic:cNvPicPr>
                   </pic:nvPicPr>
                   <pic:blipFill>
-                    <a:blip r:embed="rId27"/>
+                    <a:blip r:embed="rId33"/>
                     <a:stretch>
                       <a:fillRect/>
                     </a:stretch>
@@ -2085,8 +2239,8 @@
         <w:t xml:space="preserve">数据的三维总览与三组投影视图</w:t>
       </w:r>
     </w:p>
-    <w:bookmarkEnd w:id="30"/>
-    <w:bookmarkStart w:id="31" w:name="多视角可视化-1"/>
+    <w:bookmarkEnd w:id="36"/>
+    <w:bookmarkStart w:id="37" w:name="多视角可视化-1"/>
     <w:p>
       <w:pPr>
         <w:pStyle w:val="Heading3"/>
@@ -2166,9 +2320,9 @@
         <w:t xml:space="preserve">三个方向的投影，因此满足题目“从不同视角观察分布”的要求，能够同时呈现样本的整体空间形态和不同方向上的投影结构。</w:t>
       </w:r>
     </w:p>
-    <w:bookmarkEnd w:id="31"/>
-    <w:bookmarkEnd w:id="32"/>
-    <w:bookmarkStart w:id="33" w:name="讨论和扩展-1"/>
+    <w:bookmarkEnd w:id="37"/>
+    <w:bookmarkEnd w:id="38"/>
+    <w:bookmarkStart w:id="39" w:name="分析-1"/>
     <w:p>
       <w:pPr>
         <w:pStyle w:val="Heading2"/>
@@ -2186,7 +2340,7 @@
         <w:rPr>
           <w:rFonts w:hint="eastAsia"/>
         </w:rPr>
-        <w:t xml:space="preserve">讨论和扩展</w:t>
+        <w:t xml:space="preserve">分析</w:t>
       </w:r>
     </w:p>
     <w:p>
@@ -2265,8 +2419,8 @@
         <w:t xml:space="preserve">条样本，因此统计结论与可视化结果之间具有一致的数据口径。这一点对于正式报告尤为重要，因为它保证了“结论”“图像”“原始结果文件”之间可以相互印证，而不是来自不同的数据子集。</w:t>
       </w:r>
     </w:p>
-    <w:bookmarkEnd w:id="33"/>
-    <w:bookmarkEnd w:id="34"/>
+    <w:bookmarkEnd w:id="39"/>
+    <w:bookmarkEnd w:id="40"/>
     <w:sectPr>
       <w:footnotePr>
         <w:numRestart w:val="eachSect"/>
@@ -2377,8 +2531,117 @@
       </w:pPr>
     </w:lvl>
   </w:abstractNum>
+  <w:abstractNum w:abstractNumId="991">
+    <w:nsid w:val="0000A991"/>
+    <w:multiLevelType w:val="multilevel"/>
+    <w:lvl w:ilvl="0">
+      <w:numFmt w:val="bullet"/>
+      <w:lvlText w:val=""/>
+      <w:lvlJc w:val="left"/>
+      <w:pPr>
+        <w:ind w:left="720" w:hanging="360"/>
+      </w:pPr>
+      <w:rPr>
+        <w:rFonts w:ascii="Symbol" w:hAnsi="Symbol" w:cs="Symbol" w:hint="default"/>
+      </w:rPr>
+    </w:lvl>
+    <w:lvl w:ilvl="1">
+      <w:numFmt w:val="bullet"/>
+      <w:lvlText w:val="o"/>
+      <w:lvlJc w:val="left"/>
+      <w:pPr>
+        <w:ind w:left="1440" w:hanging="360"/>
+      </w:pPr>
+      <w:rPr>
+        <w:rFonts w:ascii="Courier New" w:hAnsi="Courier New" w:cs="Courier New" w:hint="default"/>
+      </w:rPr>
+    </w:lvl>
+    <w:lvl w:ilvl="2">
+      <w:numFmt w:val="bullet"/>
+      <w:lvlText w:val=""/>
+      <w:lvlJc w:val="left"/>
+      <w:pPr>
+        <w:ind w:left="2160" w:hanging="360"/>
+      </w:pPr>
+      <w:rPr>
+        <w:rFonts w:ascii="Wingdings" w:hAnsi="Wingdings" w:cs="Wingdings" w:hint="default"/>
+      </w:rPr>
+    </w:lvl>
+    <w:lvl w:ilvl="3">
+      <w:numFmt w:val="bullet"/>
+      <w:lvlText w:val=""/>
+      <w:lvlJc w:val="left"/>
+      <w:pPr>
+        <w:ind w:left="2880" w:hanging="360"/>
+      </w:pPr>
+      <w:rPr>
+        <w:rFonts w:ascii="Symbol" w:hAnsi="Symbol" w:cs="Symbol" w:hint="default"/>
+      </w:rPr>
+    </w:lvl>
+    <w:lvl w:ilvl="4">
+      <w:numFmt w:val="bullet"/>
+      <w:lvlText w:val="o"/>
+      <w:lvlJc w:val="left"/>
+      <w:pPr>
+        <w:ind w:left="3600" w:hanging="360"/>
+      </w:pPr>
+      <w:rPr>
+        <w:rFonts w:ascii="Courier New" w:hAnsi="Courier New" w:cs="Courier New" w:hint="default"/>
+      </w:rPr>
+    </w:lvl>
+    <w:lvl w:ilvl="5">
+      <w:numFmt w:val="bullet"/>
+      <w:lvlText w:val=""/>
+      <w:lvlJc w:val="left"/>
+      <w:pPr>
+        <w:ind w:left="4320" w:hanging="360"/>
+      </w:pPr>
+      <w:rPr>
+        <w:rFonts w:ascii="Wingdings" w:hAnsi="Wingdings" w:cs="Wingdings" w:hint="default"/>
+      </w:rPr>
+    </w:lvl>
+    <w:lvl w:ilvl="6">
+      <w:numFmt w:val="bullet"/>
+      <w:lvlText w:val=""/>
+      <w:lvlJc w:val="left"/>
+      <w:pPr>
+        <w:ind w:left="5040" w:hanging="360"/>
+      </w:pPr>
+      <w:rPr>
+        <w:rFonts w:ascii="Symbol" w:hAnsi="Symbol" w:cs="Symbol" w:hint="default"/>
+      </w:rPr>
+    </w:lvl>
+    <w:lvl w:ilvl="7">
+      <w:numFmt w:val="bullet"/>
+      <w:lvlText w:val="o"/>
+      <w:lvlJc w:val="left"/>
+      <w:pPr>
+        <w:ind w:left="5760" w:hanging="360"/>
+      </w:pPr>
+      <w:rPr>
+        <w:rFonts w:ascii="Courier New" w:hAnsi="Courier New" w:cs="Courier New" w:hint="default"/>
+      </w:rPr>
+    </w:lvl>
+    <w:lvl w:ilvl="8">
+      <w:numFmt w:val="bullet"/>
+      <w:lvlText w:val=""/>
+      <w:lvlJc w:val="left"/>
+      <w:pPr>
+        <w:ind w:left="6480" w:hanging="360"/>
+      </w:pPr>
+      <w:rPr>
+        <w:rFonts w:ascii="Wingdings" w:hAnsi="Wingdings" w:cs="Wingdings" w:hint="default"/>
+      </w:rPr>
+    </w:lvl>
+  </w:abstractNum>
   <w:num w:numId="1000">
     <w:abstractNumId w:val="990"/>
+  </w:num>
+  <w:num w:numId="1001">
+    <w:abstractNumId w:val="991"/>
+  </w:num>
+  <w:num w:numId="1002">
+    <w:abstractNumId w:val="991"/>
   </w:num>
 </w:numbering>
 </file>

</xml_diff>